<commit_message>
Fluency Lab worksheets, Modules 2 and 8: fewer words, stacked fractions, no word problems
Co-Authored-By: Claude Opus 5.5 <noreply@anthropic.com>
Claude-Session: https://claude.ai/code/session_014YTiyifGRnSLg5sxKHwHzH
</commit_message>
<xml_diff>
--- a/grade8/Fluency-Lab-Package/module-materials/Module-2-Multiply/FluencyLab_M2_Facts.docx
+++ b/grade8/Fluency-Lab-Package/module-materials/Module-2-Multiply/FluencyLab_M2_Facts.docx
@@ -191,7 +191,7 @@
                 <w:sz w:val="21"/>
                 <w:szCs w:val="21"/>
               </w:rPr>
-              <w:t xml:space="preserve">ten times the number, minus the number.   9 × 7 = 70 − 7 = 63.</w:t>
+              <w:t xml:space="preserve">ten times, minus the number.   9 × 7 = 70 − 7 = 63</w:t>
             </w:r>
           </w:p>
           <w:p>
@@ -213,7 +213,7 @@
                 <w:sz w:val="21"/>
                 <w:szCs w:val="21"/>
               </w:rPr>
-              <w:t xml:space="preserve">double it twice.   4 × 7 = 7 → 14 → 28.</w:t>
+              <w:t xml:space="preserve">double it twice.   4 × 7:  7 → 14 → 28</w:t>
             </w:r>
           </w:p>
           <w:p>
@@ -235,7 +235,7 @@
                 <w:sz w:val="21"/>
                 <w:szCs w:val="21"/>
               </w:rPr>
-              <w:t xml:space="preserve">double it three times.   8 × 7 = 7 → 14 → 28 → 56.</w:t>
+              <w:t xml:space="preserve">double it three times.   8 × 7:  7 → 14 → 28 → 56</w:t>
             </w:r>
           </w:p>
           <w:p>
@@ -250,14 +250,14 @@
                 <w:sz w:val="21"/>
                 <w:szCs w:val="21"/>
               </w:rPr>
-              <w:t xml:space="preserve">×11 (1 digit):  </w:t>
+              <w:t xml:space="preserve">×11:  </w:t>
             </w:r>
             <w:r>
               <w:rPr>
                 <w:sz w:val="21"/>
                 <w:szCs w:val="21"/>
               </w:rPr>
-              <w:t xml:space="preserve">write the digit twice.   11 × 6 = 66.</w:t>
+              <w:t xml:space="preserve">write the digit twice.   11 × 6 = 66</w:t>
             </w:r>
           </w:p>
           <w:p>
@@ -269,14 +269,14 @@
                 <w:sz w:val="21"/>
                 <w:szCs w:val="21"/>
               </w:rPr>
-              <w:t xml:space="preserve">Squares to just know:  </w:t>
+              <w:t xml:space="preserve">Squares:  </w:t>
             </w:r>
             <w:r>
               <w:rPr>
                 <w:sz w:val="21"/>
                 <w:szCs w:val="21"/>
               </w:rPr>
-              <w:t xml:space="preserve">6×6=36,  7×7=49,  8×8=64,  9×9=81,  12×12=144.</w:t>
+              <w:t xml:space="preserve">6 × 6 = 36,   7 × 7 = 49,   8 × 8 = 64,   9 × 9 = 81,   12 × 12 = 144</w:t>
             </w:r>
           </w:p>
         </w:tc>
@@ -295,7 +295,7 @@
           <w:sz w:val="26"/>
           <w:szCs w:val="26"/>
         </w:rPr>
-        <w:t xml:space="preserve">Fill the grid — the hard quadrant (6–12)</w:t>
+        <w:t xml:space="preserve">Fill the grid</w:t>
       </w:r>
     </w:p>
     <w:p>
@@ -308,7 +308,7 @@
           <w:sz w:val="22"/>
           <w:szCs w:val="22"/>
         </w:rPr>
-        <w:t xml:space="preserve">Multiply the row number by the column number. Time yourself, then beat it tomorrow.</w:t>
+        <w:t xml:space="preserve">Row × column. Time yourself.</w:t>
       </w:r>
     </w:p>
     <w:tbl>
@@ -2539,7 +2539,7 @@
           <w:sz w:val="26"/>
           <w:szCs w:val="26"/>
         </w:rPr>
-        <w:t xml:space="preserve">On your own — mixed facts</w:t>
+        <w:t xml:space="preserve">On your own</w:t>
       </w:r>
     </w:p>
     <w:tbl>
@@ -2940,7 +2940,7 @@
           <w:sz w:val="20"/>
           <w:szCs w:val="20"/>
         </w:rPr>
-        <w:t xml:space="preserve">Say each fact out loud as you write it. Speed comes from certainty. ★</w:t>
+        <w:t xml:space="preserve">Say each fact out loud. ★</w:t>
       </w:r>
     </w:p>
     <w:sectPr>

</xml_diff>